<commit_message>
docs: ajusta relatório do módulo 33 conforme feedback
</commit_message>
<xml_diff>
--- a/modulo33/Relatorio_Testes_Seguranca_JuiceShop.docx
+++ b/modulo33/Relatorio_Testes_Seguranca_JuiceShop.docx
@@ -107,7 +107,7 @@
           <w:iCs/>
           <w:color w:val="888888"/>
         </w:rPr>
-        <w:t>http://localhost:3000 ou http://demo.owasp-juice.shop/</w:t>
+        <w:t>http://localhost:3000</w:t>
       </w:r>
     </w:p>
     <w:p>
@@ -201,16 +201,12 @@
         <w:spacing w:after="100"/>
       </w:pPr>
       <w:r>
-        <w:t xml:space="preserve">Falha #2 — Cross-Site </w:t>
-      </w:r>
-      <w:proofErr w:type="spellStart"/>
-      <w:r>
-        <w:t>Scripting</w:t>
-      </w:r>
-      <w:proofErr w:type="spellEnd"/>
-      <w:r>
-        <w:t xml:space="preserve"> (XSS) refletido</w:t>
-      </w:r>
+        <w:t>Falha #2 — DOM-Based Cross-Site Scripting (DOM XSS)</w:t>
+      </w:r>
+      <w:proofErr w:type="spellStart"/>
+      <w:r/>
+      <w:proofErr w:type="spellEnd"/>
+      <w:r/>
     </w:p>
     <w:p>
       <w:pPr>
@@ -697,8 +693,7 @@
           <w:sz w:val="28"/>
           <w:szCs w:val="28"/>
         </w:rPr>
-        <w:lastRenderedPageBreak/>
-        <w:t xml:space="preserve">Falha #2 — </w:t>
+        <w:t>Falha #2 — DOM-Based Cross-Site Scripting (DOM XSS)</w:t>
       </w:r>
       <w:r>
         <w:rPr>
@@ -708,7 +703,6 @@
           <w:sz w:val="28"/>
           <w:szCs w:val="28"/>
         </w:rPr>
-        <w:t xml:space="preserve">Cross-Site </w:t>
       </w:r>
       <w:proofErr w:type="spellStart"/>
       <w:r>
@@ -719,7 +713,6 @@
           <w:sz w:val="28"/>
           <w:szCs w:val="28"/>
         </w:rPr>
-        <w:t>Scripting</w:t>
       </w:r>
       <w:proofErr w:type="spellEnd"/>
       <w:r>
@@ -730,7 +723,6 @@
           <w:sz w:val="28"/>
           <w:szCs w:val="28"/>
         </w:rPr>
-        <w:t xml:space="preserve"> (XSS) refletido</w:t>
       </w:r>
     </w:p>
     <w:p>
@@ -787,16 +779,12 @@
         <w:spacing w:after="150"/>
       </w:pPr>
       <w:r>
-        <w:t xml:space="preserve">O campo de busca de produtos não sanitiza a entrada do usuário antes de renderizá-la na página, permitindo a execução de código </w:t>
-      </w:r>
-      <w:proofErr w:type="spellStart"/>
-      <w:r>
-        <w:t>JavaScript</w:t>
-      </w:r>
-      <w:proofErr w:type="spellEnd"/>
-      <w:r>
-        <w:t xml:space="preserve"> arbitrário no navegador da vítima.</w:t>
-      </w:r>
+        <w:t>O campo de busca permite que a entrada fornecida pelo usuário seja manipulada no DOM da página de forma insegura, possibilitando a execução de código JavaScript no navegador.</w:t>
+      </w:r>
+      <w:proofErr w:type="spellStart"/>
+      <w:r/>
+      <w:proofErr w:type="spellEnd"/>
+      <w:r/>
     </w:p>
     <w:p>
       <w:pPr>

</xml_diff>